<commit_message>
docs(api): đồng bộ Module 1 và hướng dẫn tích hợp
</commit_message>
<xml_diff>
--- a/docs/Bao-cao-Dac-ta-API-He-thong-ProjectMgmt-v2.docx
+++ b/docs/Bao-cao-Dac-ta-API-He-thong-ProjectMgmt-v2.docx
@@ -12,7 +12,7 @@
           <w:b/>
           <w:bCs/>
         </w:rPr>
-        <w:t xml:space="preserve">BÁO CÁO ĐẶC TẢ API CHUẨN MỰC TOÀN DIỆN HỆ THỐNG - DỰ ÁN PROJECTMGMT (HUCE SCRUM PLATFORM)</w:t>
+        <w:t xml:space="preserve">BÁO CÁO ĐẶC TẢ API — HỆ THỐNG QUẢN LÝ DỰ ÁN SCRUM TÍCH HỢP AI</w:t>
       </w:r>
     </w:p>
     <w:p>
@@ -23,7 +23,7 @@
         <w:rPr>
           <w:color w:val="64748B"/>
         </w:rPr>
-        <w:t xml:space="preserve">Tác giả: Nhóm 7 — Tran Hoang (IdentityExperience), Thế Hoài (Planning), Huy Hoàng (DeliveryIntelligence) | Phiên bản: 2.1.0 (Strict Frontend-Backend Alignment Release) | 128 Endpoints | 55 DB Tables</w:t>
+        <w:t xml:space="preserve">Tác giả: Nhóm 7 — Tran Hoang (IdentityExperience), Thế Hoài (Planning), Huy Hoàng (DeliveryIntelligence) | Phiên bản: 2.2.0 (Đồng bộ Module 1 IdentityExperience) | 128 Endpoints | 55 DB Tables</w:t>
       </w:r>
     </w:p>
     <w:p>
@@ -3194,7 +3194,7 @@
           <w:b/>
           <w:bCs/>
         </w:rPr>
-        <w:t xml:space="preserve">/api/v1/projects/{projectKey}/members - Danh sách thành viên &amp; Vai trò trong Dự án</w:t>
+        <w:t xml:space="preserve">/api/v1/projects/{projectId}/members - Danh sách thành viên &amp; Vai trò trong Dự án</w:t>
       </w:r>
     </w:p>
     <w:tbl>
@@ -3305,7 +3305,7 @@
           <w:b/>
           <w:bCs/>
         </w:rPr>
-        <w:t xml:space="preserve">/api/v1/projects/{projectKey}/members - Mời / Phân công thành viên mới vào Dự án</w:t>
+        <w:t xml:space="preserve">/api/v1/projects/{projectId}/members - Mời / Phân công thành viên mới vào Dự án</w:t>
       </w:r>
     </w:p>
     <w:tbl>
@@ -3410,7 +3410,7 @@
           <w:b/>
           <w:bCs/>
         </w:rPr>
-        <w:t xml:space="preserve">/api/v1/projects/{projectKey}/members/{userId}/role - Thay đổi Vai trò chức danh của thành viên trong Dự án</w:t>
+        <w:t xml:space="preserve">/api/v1/projects/{projectId}/members/{userId}/role - Thay đổi Vai trò chức danh của thành viên trong Dự án</w:t>
       </w:r>
     </w:p>
     <w:tbl>
@@ -3514,7 +3514,7 @@
           <w:b/>
           <w:bCs/>
         </w:rPr>
-        <w:t xml:space="preserve">/api/v1/projects/{projectKey}/members/{userId} - Gỡ thành viên khỏi Dự án</w:t>
+        <w:t xml:space="preserve">/api/v1/projects/{projectId}/members/{userId} - Gỡ thành viên khỏi Dự án</w:t>
       </w:r>
     </w:p>
     <w:tbl>
@@ -3679,16 +3679,18 @@
   "items": [
     {
       "notificationId": "UUID",
-      "type": "IssueAssigned",
+      "type": "ProjectInvitation",
       "title": "string",
       "content": "string",
-      "entityType": "Issue",
+      "entityType": "Project",
       "entityId": "UUID",
       "isRead": false,
       "createdAt": "ISO 8601"
     }
   ],
-  "unreadCount": 5
+  "totalCount": 25,
+  "page": 1,
+  "pageSize": 20
 }</w:t>
             </w:r>
           </w:p>
@@ -3992,7 +3994,8 @@
           <w:p>
             <w:r>
               <w:t xml:space="preserve">{
-  "readCount": 5
+  "unreadCount": 0,
+  "totalCount": 5
 }</w:t>
             </w:r>
           </w:p>
@@ -4085,14 +4088,14 @@
         <w:tc>
           <w:p>
             <w:r>
-              <w:t xml:space="preserve">Header Bearer JWT Token</w:t>
-            </w:r>
-          </w:p>
-        </w:tc>
-        <w:tc>
-          <w:p>
-            <w:r>
-              <w:t xml:space="preserve">"Event push: ReceiveNotification(NotificationDTO)"</w:t>
+              <w:t xml:space="preserve">JWT qua accessTokenFactory</w:t>
+            </w:r>
+          </w:p>
+        </w:tc>
+        <w:tc>
+          <w:p>
+            <w:r>
+              <w:t xml:space="preserve">"Event push: notificationReceived(NotificationDto)"</w:t>
             </w:r>
           </w:p>
         </w:tc>
@@ -4186,8 +4189,6 @@
             <w:r>
               <w:t xml:space="preserve">{
   "issueId": "UUID",
-  "storyTitle": "string",
-  "storyDescription": "string",
   "projectContext": "string"
 }</w:t>
             </w:r>
@@ -4198,9 +4199,11 @@
             <w:r>
               <w:t xml:space="preserve">{
   "generationId": "UUID",
-  "status": "Completed | Processing",
+  "status": "Completed",
+  "modelVersion": "fake:deterministic-breakdown-v1",
   "suggestedSubTasks": [
     {
+      "suggestedTaskId": "UUID",
       "tempId": "temp_1",
       "title": "string",
       "description": "string",
@@ -4311,10 +4314,10 @@
             <w:r>
               <w:t xml:space="preserve">{
   "generationId": "UUID",
-  "modelVersion": "qwen2.5:3b-instruct",
-  "promptVersion": "v1.0",
+  "modelVersion": "fake:deterministic-breakdown-v1",
+  "promptVersion": "breakdown.system.v1",
   "suggestedSubTasks": [
-    "array of TaskDTO"
+    "array of AiBreakdownDto"
   ]
 }</w:t>
             </w:r>
@@ -4355,7 +4358,7 @@
           <w:b/>
           <w:bCs/>
         </w:rPr>
-        <w:t xml:space="preserve">/api/v1/ai/breakdown/apply - AI 1: Chấp nhận &amp; tạo Sub-tasks thật</w:t>
+        <w:t xml:space="preserve">/api/v1/ai/breakdown/{generationId}/apply - AI 1: Chấp nhận &amp; tạo Sub-tasks thật</w:t>
       </w:r>
     </w:p>
     <w:tbl>
@@ -4409,14 +4412,14 @@
           <w:p>
             <w:r>
               <w:t xml:space="preserve">{
-  "generationId": "UUID",
   "parentIssueId": "UUID",
   "selectedSubTasks": [
     {
-      "title": "string",
-      "description": "string",
+      "suggestedTaskId": "UUID",
+      "finalSummary": "string",
+      "finalDescription": "string",
       "estimatedHours": 4,
-      "acceptanceCriteria": [
+      "finalAcceptanceCriteria": [
         "string"
       ]
     }
@@ -4431,7 +4434,7 @@
               <w:t xml:space="preserve">{
   "createdSubTasks": [
     {
-      "issueId": "UUID",
+      "createdIssueId": "UUID",
       "issueKey": "CRM-105",
       "title": "string"
     }
@@ -4475,7 +4478,7 @@
           <w:b/>
           <w:bCs/>
         </w:rPr>
-        <w:t xml:space="preserve">/api/v1/ai/breakdown/feedback - AI 1: Ghi nhận phản hồi đánh giá gợi ý</w:t>
+        <w:t xml:space="preserve">/api/v1/ai/breakdown/{generationId}/feedback - AI 1: Ghi nhận phản hồi đánh giá gợi ý</w:t>
       </w:r>
     </w:p>
     <w:tbl>
@@ -4529,20 +4532,20 @@
           <w:p>
             <w:r>
               <w:t xml:space="preserve">{
-  "generationId": "UUID",
   "suggestedTaskId": "UUID",
   "userAction": "Kept | Edited | Rejected",
   "finalSummary": "string",
-  "editDistanceRatio": 0.15
-}</w:t>
-            </w:r>
-          </w:p>
-        </w:tc>
-        <w:tc>
-          <w:p>
-            <w:r>
-              <w:t xml:space="preserve">{
-  "feedbackLogged": true
+  "rejectReason": "string khi Rejected"
+}</w:t>
+            </w:r>
+          </w:p>
+        </w:tc>
+        <w:tc>
+          <w:p>
+            <w:r>
+              <w:t xml:space="preserve">{
+  "feedbackLogged": true,
+  "editDistanceRatio": "backend tự tính"
 }</w:t>
             </w:r>
           </w:p>
@@ -14505,7 +14508,7 @@
         <w:sz w:val="18"/>
         <w:szCs w:val="18"/>
       </w:rPr>
-      <w:t xml:space="preserve">PROJECTMGMT - BÁO CÁO ĐẶC TẢ API CHUẨN MỰC (128 ENDPOINTS)</w:t>
+      <w:t xml:space="preserve">HỆ THỐNG QUẢN LÝ DỰ ÁN SCRUM TÍCH HỢP AI — ĐẶC TẢ API</w:t>
     </w:r>
   </w:p>
 </w:hdr>

</xml_diff>